<commit_message>
Updated documents.All documents have been approved
</commit_message>
<xml_diff>
--- a/Requirements_and_documents/Phase_1/ADR-001-Solution-Deployment-Model.docx
+++ b/Requirements_and_documents/Phase_1/ADR-001-Solution-Deployment-Model.docx
@@ -77,7 +77,7 @@
         <w:rPr>
           <w:rFonts w:ascii="Times New Roman" w:hAnsi="Times New Roman"/>
         </w:rPr>
-        <w:t>Proposed / Under Team Review</w:t>
+        <w:t>Accepted</w:t>
       </w:r>
     </w:p>
     <w:p/>
@@ -118,10 +118,7 @@
     <w:p>
       <w:pPr>
         <w:pStyle w:val="a4"/>
-        <w:numPr>
-          <w:ilvl w:val="0"/>
-          <w:numId w:val="1"/>
-        </w:numPr>
+        <w:ind w:left="420"/>
         <w:rPr>
           <w:b/>
           <w:bCs/>
@@ -132,7 +129,7 @@
           <w:b/>
           <w:bCs/>
         </w:rPr>
-        <w:t>Option B: Customer/team-controlled centralized deployment</w:t>
+        <w:t>Customer/team-controlled centralized deployment</w:t>
       </w:r>
     </w:p>
     <w:p>
@@ -156,40 +153,6 @@
       <w:pPr>
         <w:pStyle w:val="a4"/>
       </w:pPr>
-    </w:p>
-    <w:p>
-      <w:pPr>
-        <w:pStyle w:val="a4"/>
-      </w:pPr>
-    </w:p>
-    <w:p>
-      <w:pPr>
-        <w:pStyle w:val="a4"/>
-        <w:numPr>
-          <w:ilvl w:val="0"/>
-          <w:numId w:val="1"/>
-        </w:numPr>
-        <w:rPr>
-          <w:b/>
-          <w:bCs/>
-        </w:rPr>
-      </w:pPr>
-      <w:r>
-        <w:rPr>
-          <w:b/>
-          <w:bCs/>
-        </w:rPr>
-        <w:t>Option C: Vendor-hosted SaaS deployment</w:t>
-      </w:r>
-    </w:p>
-    <w:p>
-      <w:pPr>
-        <w:pStyle w:val="a4"/>
-        <w:ind w:firstLine="420"/>
-      </w:pPr>
-      <w:r>
-        <w:t>The vendor hosts and manages the platform, and customers access it through the internet.</w:t>
-      </w:r>
     </w:p>
     <w:p>
       <w:pPr>
@@ -284,7 +247,6 @@
           <w:sz w:val="21"/>
           <w:szCs w:val="21"/>
         </w:rPr>
-        <w:lastRenderedPageBreak/>
         <w:t>Backend API</w:t>
       </w:r>
     </w:p>
@@ -348,6 +310,7 @@
           <w:sz w:val="21"/>
           <w:szCs w:val="21"/>
         </w:rPr>
+        <w:lastRenderedPageBreak/>
         <w:t>AI Service</w:t>
       </w:r>
     </w:p>
@@ -1108,6 +1071,12 @@
         </w:rPr>
         <w:t>Network Access Assumption</w:t>
       </w:r>
+      <w:r>
+        <w:rPr>
+          <w:rFonts w:ascii="Times New Roman" w:hAnsi="Times New Roman" w:hint="default"/>
+        </w:rPr>
+        <w:t>)</w:t>
+      </w:r>
     </w:p>
     <w:p>
       <w:pPr>
@@ -1478,7 +1447,7 @@
           <w:rFonts w:ascii="Times New Roman" w:hAnsi="Times New Roman" w:hint="default"/>
         </w:rPr>
         <w:lastRenderedPageBreak/>
-        <w:t>Open Decision Point: Infrastructure Responsibility</w:t>
+        <w:t>Infrastructure Responsibility</w:t>
       </w:r>
     </w:p>
     <w:p>

</xml_diff>